<commit_message>
Link maar github toegvoegd
</commit_message>
<xml_diff>
--- a/README-van-ChrisLommerse-BasRaadsveld-LoesHoogmoed-en-BaukeBosma.docx
+++ b/README-van-ChrisLommerse-BasRaadsveld-LoesHoogmoed-en-BaukeBosma.docx
@@ -95,6 +95,60 @@
       <w:r>
         <w:t xml:space="preserve"> </w:t>
       </w:r>
+      <w:r>
+        <w:br/>
+      </w:r>
+    </w:p>
+    <w:p>
+      <w:r>
+        <w:t xml:space="preserve">De link naar de </w:t>
+      </w:r>
+      <w:proofErr w:type="spellStart"/>
+      <w:r>
+        <w:t>Github</w:t>
+      </w:r>
+      <w:proofErr w:type="spellEnd"/>
+      <w:r>
+        <w:t xml:space="preserve"> </w:t>
+      </w:r>
+      <w:proofErr w:type="spellStart"/>
+      <w:r>
+        <w:t>Repository</w:t>
+      </w:r>
+      <w:proofErr w:type="spellEnd"/>
+      <w:r>
+        <w:t xml:space="preserve"> is: </w:t>
+      </w:r>
+      <w:hyperlink r:id="rId7" w:history="1">
+        <w:r>
+          <w:rPr>
+            <w:rStyle w:val="Hyperlink"/>
+          </w:rPr>
+          <w:t xml:space="preserve">Chris-17Lommerse/NoSQLProject_TheGardenGroup-van-Loes-Bauke-Bas-en-Chris: Dit is de </w:t>
+        </w:r>
+        <w:proofErr w:type="spellStart"/>
+        <w:r>
+          <w:rPr>
+            <w:rStyle w:val="Hyperlink"/>
+          </w:rPr>
+          <w:t>repository</w:t>
+        </w:r>
+        <w:proofErr w:type="spellEnd"/>
+        <w:r>
+          <w:rPr>
+            <w:rStyle w:val="Hyperlink"/>
+          </w:rPr>
+          <w:t xml:space="preserve"> voor The Garden Group project voor het vak </w:t>
+        </w:r>
+        <w:proofErr w:type="spellStart"/>
+        <w:r>
+          <w:rPr>
+            <w:rStyle w:val="Hyperlink"/>
+          </w:rPr>
+          <w:t>NoSQL</w:t>
+        </w:r>
+        <w:proofErr w:type="spellEnd"/>
+      </w:hyperlink>
       <w:r>
         <w:br w:type="page"/>
       </w:r>
@@ -1269,7 +1323,7 @@
                     <pic:cNvPicPr/>
                   </pic:nvPicPr>
                   <pic:blipFill>
-                    <a:blip r:embed="rId7"/>
+                    <a:blip r:embed="rId8"/>
                     <a:stretch>
                       <a:fillRect/>
                     </a:stretch>
@@ -1420,7 +1474,7 @@
                     <pic:cNvPicPr/>
                   </pic:nvPicPr>
                   <pic:blipFill>
-                    <a:blip r:embed="rId8"/>
+                    <a:blip r:embed="rId9"/>
                     <a:stretch>
                       <a:fillRect/>
                     </a:stretch>
@@ -1657,7 +1711,7 @@
                     <pic:cNvPicPr/>
                   </pic:nvPicPr>
                   <pic:blipFill>
-                    <a:blip r:embed="rId9"/>
+                    <a:blip r:embed="rId10"/>
                     <a:stretch>
                       <a:fillRect/>
                     </a:stretch>
@@ -1847,7 +1901,7 @@
                     <pic:cNvPicPr/>
                   </pic:nvPicPr>
                   <pic:blipFill>
-                    <a:blip r:embed="rId10"/>
+                    <a:blip r:embed="rId11"/>
                     <a:stretch>
                       <a:fillRect/>
                     </a:stretch>
@@ -1960,7 +2014,7 @@
                     <pic:cNvPicPr/>
                   </pic:nvPicPr>
                   <pic:blipFill>
-                    <a:blip r:embed="rId11"/>
+                    <a:blip r:embed="rId12"/>
                     <a:stretch>
                       <a:fillRect/>
                     </a:stretch>
@@ -2067,7 +2121,7 @@
                     <pic:cNvPicPr/>
                   </pic:nvPicPr>
                   <pic:blipFill>
-                    <a:blip r:embed="rId12"/>
+                    <a:blip r:embed="rId13"/>
                     <a:stretch>
                       <a:fillRect/>
                     </a:stretch>
@@ -2198,7 +2252,7 @@
                     <pic:cNvPicPr/>
                   </pic:nvPicPr>
                   <pic:blipFill>
-                    <a:blip r:embed="rId13"/>
+                    <a:blip r:embed="rId14"/>
                     <a:stretch>
                       <a:fillRect/>
                     </a:stretch>
@@ -2241,7 +2295,7 @@
                     <pic:cNvPicPr/>
                   </pic:nvPicPr>
                   <pic:blipFill>
-                    <a:blip r:embed="rId14"/>
+                    <a:blip r:embed="rId15"/>
                     <a:stretch>
                       <a:fillRect/>
                     </a:stretch>
@@ -2354,7 +2408,7 @@
                     <pic:cNvPicPr/>
                   </pic:nvPicPr>
                   <pic:blipFill>
-                    <a:blip r:embed="rId15"/>
+                    <a:blip r:embed="rId16"/>
                     <a:stretch>
                       <a:fillRect/>
                     </a:stretch>
@@ -2397,7 +2451,7 @@
                     <pic:cNvPicPr/>
                   </pic:nvPicPr>
                   <pic:blipFill>
-                    <a:blip r:embed="rId16"/>
+                    <a:blip r:embed="rId17"/>
                     <a:stretch>
                       <a:fillRect/>
                     </a:stretch>
@@ -2571,10 +2625,7 @@
       <w:bookmarkStart w:id="13" w:name="_Toc213923694"/>
       <w:r>
         <w:lastRenderedPageBreak/>
-        <w:t>De gemaakte keuzes met betrekking tot de code van B</w:t>
-      </w:r>
-      <w:r>
-        <w:t>auke Bosma</w:t>
+        <w:t>De gemaakte keuzes met betrekking tot de code van Bauke Bosma</w:t>
       </w:r>
       <w:bookmarkEnd w:id="13"/>
     </w:p>
@@ -2598,10 +2649,7 @@
       <w:bookmarkStart w:id="14" w:name="_Toc213923695"/>
       <w:r>
         <w:lastRenderedPageBreak/>
-        <w:t>De gemaakte keuzes met betrekking tot de code van</w:t>
-      </w:r>
-      <w:r>
-        <w:t xml:space="preserve"> Loes Hoogmoed</w:t>
+        <w:t>De gemaakte keuzes met betrekking tot de code van Loes Hoogmoed</w:t>
       </w:r>
       <w:bookmarkEnd w:id="14"/>
       <w:r>
@@ -2609,7 +2657,7 @@
       </w:r>
     </w:p>
     <w:sectPr>
-      <w:footerReference w:type="default" r:id="rId17"/>
+      <w:footerReference w:type="default" r:id="rId18"/>
       <w:pgSz w:w="11906" w:h="16838"/>
       <w:pgMar w:top="1417" w:right="1417" w:bottom="1417" w:left="1417" w:header="708" w:footer="708" w:gutter="0"/>
       <w:cols w:space="708"/>
@@ -3311,7 +3359,6 @@
   <w:style w:type="character" w:default="1" w:styleId="Standaardalinea-lettertype">
     <w:name w:val="Default Paragraph Font"/>
     <w:uiPriority w:val="1"/>
-    <w:semiHidden/>
     <w:unhideWhenUsed/>
   </w:style>
   <w:style w:type="table" w:default="1" w:styleId="Standaardtabel">

</xml_diff>